<commit_message>
made after submitting to joural ready for thesis
</commit_message>
<xml_diff>
--- a/manuscript/Cover Letter.docx
+++ b/manuscript/Cover Letter.docx
@@ -1,515 +1,658 @@
 
 <file path=word/document.xml><?xml version="1.0" encoding="utf-8"?>
-<w:document xmlns:wpc="http://schemas.microsoft.com/office/word/2010/wordprocessingCanvas" xmlns:cx="http://schemas.microsoft.com/office/drawing/2014/chartex" xmlns:cx1="http://schemas.microsoft.com/office/drawing/2015/9/8/chartex" xmlns:cx2="http://schemas.microsoft.com/office/drawing/2015/10/21/chartex" xmlns:cx3="http://schemas.microsoft.com/office/drawing/2016/5/9/chartex" xmlns:cx4="http://schemas.microsoft.com/office/drawing/2016/5/10/chartex" xmlns:cx5="http://schemas.microsoft.com/office/drawing/2016/5/11/chartex" xmlns:cx6="http://schemas.microsoft.com/office/drawing/2016/5/12/chartex" xmlns:cx7="http://schemas.microsoft.com/office/drawing/2016/5/13/chartex" xmlns:cx8="http://schemas.microsoft.com/office/drawing/2016/5/14/chartex" xmlns:mc="http://schemas.openxmlformats.org/markup-compatibility/2006" xmlns:aink="http://schemas.microsoft.com/office/drawing/2016/ink" xmlns:am3d="http://schemas.microsoft.com/office/drawing/2017/model3d" xmlns:o="urn:schemas-microsoft-com:office:office" xmlns:oel="http://schemas.microsoft.com/office/2019/extlst" xmlns:r="http://schemas.openxmlformats.org/officeDocument/2006/relationships" xmlns:m="http://schemas.openxmlformats.org/officeDocument/2006/math" xmlns:v="urn:schemas-microsoft-com:vml" xmlns:wp14="http://schemas.microsoft.com/office/word/2010/wordprocessingDrawing" xmlns:wp="http://schemas.openxmlformats.org/drawingml/2006/wordprocessingDrawing" xmlns:w10="urn:schemas-microsoft-com:office:word" xmlns:w="http://schemas.openxmlformats.org/wordprocessingml/2006/main" xmlns:w14="http://schemas.microsoft.com/office/word/2010/wordml" xmlns:w15="http://schemas.microsoft.com/office/word/2012/wordml" xmlns:w16cei="http://schemas.microsoft.com/office/word/2026/wordml/cei" xmlns:w16cex="http://schemas.microsoft.com/office/word/2018/wordml/cex" xmlns:w16cid="http://schemas.microsoft.com/office/word/2016/wordml/cid" xmlns:w16="http://schemas.microsoft.com/office/word/2018/wordml" xmlns:w16du="http://schemas.microsoft.com/office/word/2023/wordml/word16du" xmlns:w16sdtdh="http://schemas.microsoft.com/office/word/2020/wordml/sdtdatahash" xmlns:w16sdtfl="http://schemas.microsoft.com/office/word/2024/wordml/sdtformatlock" xmlns:w16se="http://schemas.microsoft.com/office/word/2015/wordml/symex" xmlns:wpg="http://schemas.microsoft.com/office/word/2010/wordprocessingGroup" xmlns:wpi="http://schemas.microsoft.com/office/word/2010/wordprocessingInk" xmlns:wne="http://schemas.microsoft.com/office/word/2006/wordml" xmlns:wps="http://schemas.microsoft.com/office/word/2010/wordprocessingShape" mc:Ignorable="w14 w15 w16se w16cid w16 w16cex w16sdtdh w16sdtfl w16du wp14">
+<w:document xmlns:wpc="http://schemas.microsoft.com/office/word/2010/wordprocessingCanvas" xmlns:cx="http://schemas.microsoft.com/office/drawing/2014/chartex" xmlns:cx1="http://schemas.microsoft.com/office/drawing/2015/9/8/chartex" xmlns:cx2="http://schemas.microsoft.com/office/drawing/2015/10/21/chartex" xmlns:cx3="http://schemas.microsoft.com/office/drawing/2016/5/9/chartex" xmlns:cx4="http://schemas.microsoft.com/office/drawing/2016/5/10/chartex" xmlns:cx5="http://schemas.microsoft.com/office/drawing/2016/5/11/chartex" xmlns:cx6="http://schemas.microsoft.com/office/drawing/2016/5/12/chartex" xmlns:cx7="http://schemas.microsoft.com/office/drawing/2016/5/13/chartex" xmlns:cx8="http://schemas.microsoft.com/office/drawing/2016/5/14/chartex" xmlns:mc="http://schemas.openxmlformats.org/markup-compatibility/2006" xmlns:aink="http://schemas.microsoft.com/office/drawing/2016/ink" xmlns:am3d="http://schemas.microsoft.com/office/drawing/2017/model3d" xmlns:o="urn:schemas-microsoft-com:office:office" xmlns:oel="http://schemas.microsoft.com/office/2019/extlst" xmlns:r="http://schemas.openxmlformats.org/officeDocument/2006/relationships" xmlns:m="http://schemas.openxmlformats.org/officeDocument/2006/math" xmlns:v="urn:schemas-microsoft-com:vml" xmlns:wp14="http://schemas.microsoft.com/office/word/2010/wordprocessingDrawing" xmlns:wp="http://schemas.openxmlformats.org/drawingml/2006/wordprocessingDrawing" xmlns:w10="urn:schemas-microsoft-com:office:word" xmlns:w="http://schemas.openxmlformats.org/wordprocessingml/2006/main" xmlns:w14="http://schemas.microsoft.com/office/word/2010/wordml" xmlns:w15="http://schemas.microsoft.com/office/word/2012/wordml" xmlns:w16cex="http://schemas.microsoft.com/office/word/2018/wordml/cex" xmlns:w16cid="http://schemas.microsoft.com/office/word/2016/wordml/cid" xmlns:w16="http://schemas.microsoft.com/office/word/2018/wordml" xmlns:w16du="http://schemas.microsoft.com/office/word/2023/wordml/word16du" xmlns:w16sdtdh="http://schemas.microsoft.com/office/word/2020/wordml/sdtdatahash" xmlns:w16sdtfl="http://schemas.microsoft.com/office/word/2024/wordml/sdtformatlock" xmlns:w16se="http://schemas.microsoft.com/office/word/2015/wordml/symex" xmlns:wpg="http://schemas.microsoft.com/office/word/2010/wordprocessingGroup" xmlns:wpi="http://schemas.microsoft.com/office/word/2010/wordprocessingInk" xmlns:wne="http://schemas.microsoft.com/office/word/2006/wordml" xmlns:wps="http://schemas.microsoft.com/office/word/2010/wordprocessingShape" mc:Ignorable="w14 w15 w16se w16cid w16 w16cex w16sdtdh w16sdtfl w16du wp14">
   <w:body>
     <w:p>
       <w:pPr>
-        <w:rPr>
-          <w:del w:author="Frank Burdon" w:date="2026-09-10T05:37:45.316Z" w16du:dateUtc="2026-09-10T05:37:45.316Z" w:id="183031713"/>
-          <w:b w:val="1"/>
-          <w:bCs w:val="1"/>
-        </w:rPr>
+        <w:spacing w:before="80" w:after="0"/>
+        <w:jc w:val="both"/>
       </w:pPr>
-      <w:del w:author="Frank Burdon" w:date="2026-09-10T05:37:45.316Z" w16du:dateUtc="2026-09-10T05:37:45.316Z" w:id="1690125331">
-        <w:r>
-          <w:rPr>
-            <w:b w:val="1"/>
-            <w:bCs w:val="1"/>
-          </w:rPr>
-          <w:delText>Cover Letter</w:delText>
-        </w:r>
-      </w:del>
+      <w:r>
+        <w:t xml:space="preserve">Dear </w:t>
+      </w:r>
+      <w:r>
+        <w:t>E</w:t>
+      </w:r>
+      <w:r>
+        <w:t>ditor,</w:t>
+      </w:r>
     </w:p>
     <w:p>
       <w:pPr>
-        <w:rPr>
-          <w:del w:author="Frank Burdon" w:date="2026-09-10T05:37:29.06Z" w16du:dateUtc="2026-09-10T05:37:29.06Z" w:id="742660924"/>
-        </w:rPr>
+        <w:spacing w:before="80" w:after="0"/>
+        <w:jc w:val="both"/>
       </w:pPr>
+      <w:r>
+        <w:t xml:space="preserve">We would like to submit our manuscript entitled </w:t>
+      </w:r>
+      <w:r>
+        <w:t>“</w:t>
+      </w:r>
+      <w:r>
+        <w:t>Stone pile refuges in an Aotearoa New Zealand lake: early benefits for a threatened crayfish but not its invasive predator”</w:t>
+      </w:r>
+      <w:r>
+        <w:t xml:space="preserve"> to the Journal of Applied Ecology.</w:t>
+      </w:r>
     </w:p>
     <w:p>
       <w:pPr>
-        <w:pStyle w:val="Normal"/>
-        <w:suppressLineNumbers w:val="0"/>
-        <w:bidi w:val="0"/>
-        <w:spacing w:before="0" w:beforeAutospacing="off" w:after="160" w:afterAutospacing="off" w:line="259" w:lineRule="auto"/>
-        <w:ind w:left="0" w:right="0"/>
-        <w:jc w:val="left"/>
+        <w:spacing w:before="80" w:after="0" w:line="240" w:lineRule="auto"/>
+        <w:jc w:val="both"/>
+        <w:rPr>
+          <w:rFonts w:ascii="Calibri" w:eastAsia="Calibri" w:hAnsi="Calibri" w:cs="Calibri"/>
+        </w:rPr>
       </w:pPr>
       <w:r>
-        <w:rPr/>
-        <w:t xml:space="preserve">Dear </w:t>
-      </w:r>
-      <w:del w:author="Frank Burdon" w:date="2026-09-10T05:37:26.892Z" w16du:dateUtc="2026-09-10T05:37:26.892Z" w:id="328248121">
-        <w:r>
-          <w:delText>e</w:delText>
-        </w:r>
-      </w:del>
-      <w:ins w:author="Frank Burdon" w:date="2026-09-10T05:37:26.936Z" w16du:dateUtc="2026-09-10T05:37:26.936Z" w:id="46886868">
-        <w:r>
-          <w:t>E</w:t>
-        </w:r>
-      </w:ins>
-      <w:r>
-        <w:rPr/>
-        <w:t xml:space="preserve">ditor, </w:t>
-      </w:r>
-    </w:p>
-    <w:p>
-      <w:r>
-        <w:rPr/>
-        <w:t xml:space="preserve">We would like to submit our manuscript entitled </w:t>
-      </w:r>
-      <w:r>
-        <w:rPr/>
-        <w:t>“</w:t>
-      </w:r>
-      <w:commentRangeStart w:id="1087078760"/>
-      <w:r>
-        <w:rPr/>
-        <w:t>Habitat enhancement for a native freshwater crayfish threatened by an invasive predator: a field trial of stone pile structures in an Aotearoa New Zealand lake</w:t>
-      </w:r>
-      <w:commentRangeEnd w:id="1087078760"/>
-      <w:r>
-        <w:rPr>
-          <w:rStyle w:val="CommentReference"/>
-        </w:rPr>
-        <w:commentReference w:id="1087078760"/>
-      </w:r>
-      <w:r>
-        <w:rPr/>
-        <w:t>”</w:t>
-      </w:r>
-      <w:r>
-        <w:rPr/>
-        <w:t xml:space="preserve"> to the Journal of Applied Ecology.</w:t>
+        <w:t>Restoration ecology recognises species decline</w:t>
+      </w:r>
+      <w:r>
+        <w:t>s</w:t>
+      </w:r>
+      <w:r>
+        <w:t xml:space="preserve"> </w:t>
+      </w:r>
+      <w:r>
+        <w:t>are</w:t>
+      </w:r>
+      <w:r>
+        <w:t xml:space="preserve"> driven by multiple stressors, yet interventions typically target one </w:t>
+      </w:r>
+      <w:r>
+        <w:t xml:space="preserve">stressor </w:t>
+      </w:r>
+      <w:r>
+        <w:t>at a time</w:t>
+      </w:r>
+      <w:r>
+        <w:t>.</w:t>
+      </w:r>
+      <w:r>
+        <w:t xml:space="preserve"> </w:t>
+      </w:r>
+      <w:r>
+        <w:t>First, w</w:t>
+      </w:r>
+      <w:r>
+        <w:t xml:space="preserve">hen stressors like invasive predators and habitat compression cannot be eliminated, managers need </w:t>
+      </w:r>
+      <w:r>
+        <w:t>remediation</w:t>
+      </w:r>
+      <w:r>
+        <w:t xml:space="preserve"> tools that deliver benefits despite ong</w:t>
+      </w:r>
+      <w:r>
+        <w:t xml:space="preserve">oing </w:t>
+      </w:r>
+      <w:r>
+        <w:t>pressure</w:t>
+      </w:r>
+      <w:r>
+        <w:t>.</w:t>
+      </w:r>
+      <w:r>
+        <w:t xml:space="preserve"> </w:t>
+      </w:r>
+      <w:r>
+        <w:rPr>
+          <w:rFonts w:ascii="Calibri" w:eastAsia="Calibri" w:hAnsi="Calibri" w:cs="Calibri"/>
+        </w:rPr>
+        <w:t>Second</w:t>
+      </w:r>
+      <w:r>
+        <w:rPr>
+          <w:rFonts w:ascii="Calibri" w:eastAsia="Calibri" w:hAnsi="Calibri" w:cs="Calibri"/>
+        </w:rPr>
+        <w:t xml:space="preserve">, </w:t>
+      </w:r>
+      <w:r>
+        <w:rPr>
+          <w:rFonts w:ascii="Calibri" w:eastAsia="Calibri" w:hAnsi="Calibri" w:cs="Calibri"/>
+        </w:rPr>
+        <w:t xml:space="preserve">restoration </w:t>
+      </w:r>
+      <w:r>
+        <w:rPr>
+          <w:rFonts w:ascii="Calibri" w:eastAsia="Calibri" w:hAnsi="Calibri" w:cs="Calibri"/>
+        </w:rPr>
+        <w:t xml:space="preserve">projects </w:t>
+      </w:r>
+      <w:r>
+        <w:rPr>
+          <w:rFonts w:ascii="Calibri" w:eastAsia="Calibri" w:hAnsi="Calibri" w:cs="Calibri"/>
+        </w:rPr>
+        <w:t xml:space="preserve">that </w:t>
+      </w:r>
+      <w:r>
+        <w:rPr>
+          <w:rFonts w:ascii="Calibri" w:eastAsia="Calibri" w:hAnsi="Calibri" w:cs="Calibri"/>
+        </w:rPr>
+        <w:t xml:space="preserve">involve </w:t>
+      </w:r>
+      <w:r>
+        <w:rPr>
+          <w:rFonts w:ascii="Calibri" w:eastAsia="Calibri" w:hAnsi="Calibri" w:cs="Calibri"/>
+        </w:rPr>
+        <w:t>habitat</w:t>
+      </w:r>
+      <w:r>
+        <w:rPr>
+          <w:rFonts w:ascii="Calibri" w:eastAsia="Calibri" w:hAnsi="Calibri" w:cs="Calibri"/>
+        </w:rPr>
+        <w:t xml:space="preserve"> enhancement often lack adequate monitoring</w:t>
+      </w:r>
+      <w:r>
+        <w:rPr>
+          <w:rFonts w:ascii="Calibri" w:eastAsia="Calibri" w:hAnsi="Calibri" w:cs="Calibri"/>
+        </w:rPr>
+        <w:t>—</w:t>
+      </w:r>
+      <w:r>
+        <w:rPr>
+          <w:rFonts w:ascii="Calibri" w:eastAsia="Calibri" w:hAnsi="Calibri" w:cs="Calibri"/>
+        </w:rPr>
+        <w:t xml:space="preserve">either </w:t>
+      </w:r>
+      <w:r>
+        <w:rPr>
+          <w:rFonts w:ascii="Calibri" w:eastAsia="Calibri" w:hAnsi="Calibri" w:cs="Calibri"/>
+        </w:rPr>
+        <w:t xml:space="preserve">none </w:t>
+      </w:r>
+      <w:r>
+        <w:rPr>
+          <w:rFonts w:ascii="Calibri" w:eastAsia="Calibri" w:hAnsi="Calibri" w:cs="Calibri"/>
+        </w:rPr>
+        <w:t xml:space="preserve">or </w:t>
+      </w:r>
+      <w:r>
+        <w:rPr>
+          <w:rFonts w:ascii="Calibri" w:eastAsia="Calibri" w:hAnsi="Calibri" w:cs="Calibri"/>
+        </w:rPr>
+        <w:t>using designs incapable of distinguishing</w:t>
+      </w:r>
+      <w:r>
+        <w:rPr>
+          <w:rFonts w:ascii="Calibri" w:eastAsia="Calibri" w:hAnsi="Calibri" w:cs="Calibri"/>
+        </w:rPr>
+        <w:t xml:space="preserve"> delayed ecological responses from true </w:t>
+      </w:r>
+      <w:r>
+        <w:rPr>
+          <w:rFonts w:ascii="Calibri" w:eastAsia="Calibri" w:hAnsi="Calibri" w:cs="Calibri"/>
+        </w:rPr>
+        <w:t>failure</w:t>
+      </w:r>
+      <w:r>
+        <w:rPr>
+          <w:rFonts w:ascii="Calibri" w:eastAsia="Calibri" w:hAnsi="Calibri" w:cs="Calibri"/>
+        </w:rPr>
+        <w:t>.</w:t>
+      </w:r>
+      <w:r>
+        <w:rPr>
+          <w:rFonts w:ascii="Calibri" w:eastAsia="Calibri" w:hAnsi="Calibri" w:cs="Calibri"/>
+        </w:rPr>
+        <w:t xml:space="preserve"> We addressed </w:t>
+      </w:r>
+      <w:r>
+        <w:t>both</w:t>
+      </w:r>
+      <w:r>
+        <w:rPr>
+          <w:rFonts w:ascii="Calibri" w:eastAsia="Calibri" w:hAnsi="Calibri" w:cs="Calibri"/>
+        </w:rPr>
+        <w:t xml:space="preserve"> </w:t>
+      </w:r>
+      <w:r>
+        <w:rPr>
+          <w:rFonts w:ascii="Calibri" w:eastAsia="Calibri" w:hAnsi="Calibri" w:cs="Calibri"/>
+        </w:rPr>
+        <w:t>gaps</w:t>
+      </w:r>
+      <w:r>
+        <w:rPr>
+          <w:rFonts w:ascii="Calibri" w:eastAsia="Calibri" w:hAnsi="Calibri" w:cs="Calibri"/>
+        </w:rPr>
+        <w:t xml:space="preserve"> directly</w:t>
+      </w:r>
+      <w:r>
+        <w:rPr>
+          <w:rFonts w:ascii="Calibri" w:eastAsia="Calibri" w:hAnsi="Calibri" w:cs="Calibri"/>
+        </w:rPr>
+        <w:t xml:space="preserve"> in </w:t>
+      </w:r>
+      <w:r>
+        <w:t xml:space="preserve">our </w:t>
+      </w:r>
+      <w:r>
+        <w:rPr>
+          <w:rFonts w:ascii="Calibri" w:eastAsia="Calibri" w:hAnsi="Calibri" w:cs="Calibri"/>
+        </w:rPr>
+        <w:t>study.</w:t>
       </w:r>
     </w:p>
     <w:p>
       <w:pPr>
-        <w:pStyle w:val="Normal"/>
-        <w:rPr>
-          <w:ins w:author="Frank Burdon" w:date="2026-09-10T05:33:27.313Z" w16du:dateUtc="2026-09-10T05:33:27.313Z" w:id="597161059"/>
-        </w:rPr>
+        <w:spacing w:before="80" w:after="0"/>
+        <w:jc w:val="both"/>
       </w:pPr>
       <w:r>
-        <w:rPr/>
+        <w:rPr>
+          <w:rFonts w:ascii="Calibri" w:eastAsia="Calibri" w:hAnsi="Calibri" w:cs="Calibri"/>
+        </w:rPr>
         <w:t>Kōura</w:t>
       </w:r>
       <w:r>
-        <w:rPr/>
+        <w:rPr>
+          <w:rFonts w:ascii="Calibri" w:eastAsia="Calibri" w:hAnsi="Calibri" w:cs="Calibri"/>
+        </w:rPr>
+        <w:t xml:space="preserve"> (</w:t>
+      </w:r>
+      <w:r>
+        <w:rPr>
+          <w:rFonts w:ascii="Calibri" w:eastAsia="Calibri" w:hAnsi="Calibri" w:cs="Calibri"/>
+          <w:i/>
+          <w:iCs/>
+        </w:rPr>
+        <w:t>Paranephrops planifrons</w:t>
+      </w:r>
+      <w:r>
+        <w:rPr>
+          <w:rFonts w:ascii="Calibri" w:eastAsia="Calibri" w:hAnsi="Calibri" w:cs="Calibri"/>
+        </w:rPr>
+        <w:t>), an ecologically and culturally vital endemic crayfish, have declined by up to 96% over the last 20 years in Lake</w:t>
+      </w:r>
+      <w:r>
+        <w:rPr>
+          <w:rFonts w:ascii="Calibri" w:eastAsia="Calibri" w:hAnsi="Calibri" w:cs="Calibri"/>
+        </w:rPr>
         <w:t xml:space="preserve"> </w:t>
       </w:r>
       <w:r>
-        <w:rPr/>
-        <w:t>(</w:t>
-      </w:r>
-      <w:r>
-        <w:rPr>
-          <w:i w:val="1"/>
-          <w:iCs w:val="1"/>
-        </w:rPr>
-        <w:t>Paranephrops</w:t>
-      </w:r>
-      <w:r>
-        <w:rPr>
-          <w:i w:val="1"/>
-          <w:iCs w:val="1"/>
+        <w:rPr>
+          <w:rFonts w:ascii="Calibri" w:eastAsia="Calibri" w:hAnsi="Calibri" w:cs="Calibri"/>
+        </w:rPr>
+        <w:t>Rotoiti</w:t>
+      </w:r>
+      <w:r>
+        <w:rPr>
+          <w:rFonts w:ascii="Calibri" w:eastAsia="Calibri" w:hAnsi="Calibri" w:cs="Calibri"/>
+        </w:rPr>
+        <w:t xml:space="preserve">, </w:t>
+      </w:r>
+      <w:r>
+        <w:t>driven by predation from an invasive catfish and by thermal stratification that compresses their habitat into the shallow littoral zone.</w:t>
+      </w:r>
+      <w:r>
+        <w:rPr>
+          <w:rFonts w:ascii="Calibri" w:eastAsia="Calibri" w:hAnsi="Calibri" w:cs="Calibri"/>
+        </w:rPr>
+        <w:t xml:space="preserve"> While structural refuges—such as coarse substrate and wood additions—are well-established in stream restoration, they are rarely tested experimentally in lakes, where predator dynamics, scale, and thermal structure differ</w:t>
+      </w:r>
+      <w:r>
+        <w:rPr>
+          <w:rFonts w:ascii="Calibri" w:eastAsia="Calibri" w:hAnsi="Calibri" w:cs="Calibri"/>
+        </w:rPr>
+        <w:t>.</w:t>
+      </w:r>
+      <w:r>
+        <w:rPr>
+          <w:rFonts w:ascii="Calibri" w:eastAsia="Calibri" w:hAnsi="Calibri" w:cs="Calibri"/>
         </w:rPr>
         <w:t xml:space="preserve"> </w:t>
       </w:r>
       <w:r>
         <w:rPr>
-          <w:i w:val="1"/>
-          <w:iCs w:val="1"/>
-        </w:rPr>
-        <w:t>planifrons</w:t>
-      </w:r>
-      <w:r>
-        <w:rPr/>
-        <w:t>)</w:t>
-      </w:r>
-      <w:r>
-        <w:rPr/>
-        <w:t xml:space="preserve">, an ecologically and culturally important endemic freshwater crayfish, have declined by up to 96% over the last 20 years in Lake Rotoiti, driven by predation from an invasive catfish and by thermal stratification that compresses their habitat into the shallow littoral zone. </w:t>
-      </w:r>
-      <w:ins w:author="Frank Burdon" w:date="2026-09-10T05:24:47.303Z" w16du:dateUtc="2026-09-10T05:24:47.303Z" w:id="1877071477">
-        <w:r>
-          <w:rPr>
-            <w:rFonts w:ascii="Calibri" w:hAnsi="Calibri" w:eastAsia="Calibri" w:cs="Calibri"/>
-            <w:noProof w:val="0"/>
-            <w:sz w:val="22"/>
-            <w:szCs w:val="22"/>
-            <w:lang w:val="en-GB"/>
-          </w:rPr>
-          <w:t xml:space="preserve">Adding structural refuge is a well-established restoration tool in streams, where coarse substrate and wood additions reliably increase crayfish abundance, but it has rarely been tested experimentally in lakes, where predator dynamics, scale, and thermal structure differ </w:t>
-        </w:r>
-        <w:r>
-          <w:rPr>
-            <w:rFonts w:ascii="Calibri" w:hAnsi="Calibri" w:eastAsia="Calibri" w:cs="Calibri"/>
-            <w:noProof w:val="0"/>
-            <w:sz w:val="22"/>
-            <w:szCs w:val="22"/>
-            <w:lang w:val="en-GB"/>
-          </w:rPr>
-          <w:t>substantially from</w:t>
-        </w:r>
-        <w:r>
-          <w:rPr>
-            <w:rFonts w:ascii="Calibri" w:hAnsi="Calibri" w:eastAsia="Calibri" w:cs="Calibri"/>
-            <w:noProof w:val="0"/>
-            <w:sz w:val="22"/>
-            <w:szCs w:val="22"/>
-            <w:lang w:val="en-GB"/>
-          </w:rPr>
-          <w:t xml:space="preserve"> flowing water. </w:t>
-        </w:r>
-      </w:ins>
-      <w:r>
-        <w:rPr/>
-        <w:t xml:space="preserve">Because neither </w:t>
-      </w:r>
-      <w:ins w:author="Frank Burdon" w:date="2026-09-10T05:25:08.1Z" w16du:dateUtc="2026-09-10T05:25:08.1Z" w:id="823929">
-        <w:r>
-          <w:rPr>
-            <w:rFonts w:ascii="Calibri" w:hAnsi="Calibri" w:eastAsia="Calibri" w:cs="Calibri"/>
-            <w:noProof w:val="0"/>
-            <w:sz w:val="22"/>
-            <w:szCs w:val="22"/>
-            <w:lang w:val="en-GB"/>
-          </w:rPr>
-          <w:t xml:space="preserve">of Lake Rotoiti's two </w:t>
-        </w:r>
-      </w:ins>
-      <w:r>
-        <w:rPr/>
-        <w:t>stressor</w:t>
-      </w:r>
-      <w:ins w:author="Frank Burdon" w:date="2026-09-10T05:25:12.092Z" w16du:dateUtc="2026-09-10T05:25:12.092Z" w:id="952344713">
-        <w:r>
-          <w:t>s</w:t>
-        </w:r>
-      </w:ins>
-      <w:r>
-        <w:rPr/>
-        <w:t xml:space="preserve"> can be removed at lake scale, we trialled stone pile structure</w:t>
-      </w:r>
-      <w:r>
-        <w:rPr/>
-        <w:t>s</w:t>
-      </w:r>
-      <w:r>
-        <w:rPr/>
-        <w:t xml:space="preserve"> as a physical refuge for </w:t>
-      </w:r>
-      <w:r>
-        <w:rPr/>
-        <w:t>kōura</w:t>
-      </w:r>
-      <w:r>
-        <w:rPr/>
-        <w:t xml:space="preserve"> over an 18-month quasi-BACI field study</w:t>
-      </w:r>
-      <w:ins w:author="Frank Burdon" w:date="2026-09-10T05:25:40.949Z" w16du:dateUtc="2026-09-10T05:25:40.949Z" w:id="257920873">
-        <w:r>
-          <w:t>.</w:t>
-        </w:r>
-        <w:r>
-          <w:rPr>
-            <w:rFonts w:ascii="Calibri" w:hAnsi="Calibri" w:eastAsia="Calibri" w:cs="Calibri"/>
-            <w:noProof w:val="0"/>
-            <w:sz w:val="22"/>
-            <w:szCs w:val="22"/>
-            <w:lang w:val="en-GB"/>
-          </w:rPr>
-          <w:t xml:space="preserve"> </w:t>
-        </w:r>
-      </w:ins>
-      <w:ins w:author="Frank Burdon" w:date="2026-09-10T05:32:26.583Z" w16du:dateUtc="2026-09-10T05:32:26.583Z" w:id="1441766053">
-        <w:r>
-          <w:rPr>
-            <w:rFonts w:ascii="Calibri" w:hAnsi="Calibri" w:eastAsia="Calibri" w:cs="Calibri"/>
-            <w:noProof w:val="0"/>
-            <w:sz w:val="22"/>
-            <w:szCs w:val="22"/>
-            <w:lang w:val="en-GB"/>
-          </w:rPr>
-          <w:t>This study provides a rare, field-based test of structural refugia as a targeted management tool against an invasive lake predator</w:t>
-        </w:r>
-      </w:ins>
-      <w:r>
-        <w:rPr/>
+          <w:rFonts w:ascii="Calibri" w:eastAsia="Calibri" w:hAnsi="Calibri" w:cs="Calibri"/>
+        </w:rPr>
+        <w:t>Because</w:t>
+      </w:r>
+      <w:r>
+        <w:rPr>
+          <w:rFonts w:ascii="Calibri" w:eastAsia="Calibri" w:hAnsi="Calibri" w:cs="Calibri"/>
+        </w:rPr>
+        <w:t xml:space="preserve"> Lake Rotoiti's stressors cannot be removed at </w:t>
+      </w:r>
+      <w:r>
+        <w:rPr>
+          <w:rFonts w:ascii="Calibri" w:eastAsia="Calibri" w:hAnsi="Calibri" w:cs="Calibri"/>
+        </w:rPr>
+        <w:t xml:space="preserve">the </w:t>
+      </w:r>
+      <w:r>
+        <w:rPr>
+          <w:rFonts w:ascii="Calibri" w:eastAsia="Calibri" w:hAnsi="Calibri" w:cs="Calibri"/>
+        </w:rPr>
+        <w:t>whole-lake</w:t>
+      </w:r>
+      <w:r>
+        <w:rPr>
+          <w:rFonts w:ascii="Calibri" w:eastAsia="Calibri" w:hAnsi="Calibri" w:cs="Calibri"/>
+        </w:rPr>
+        <w:t xml:space="preserve"> scale</w:t>
+      </w:r>
+      <w:r>
+        <w:rPr>
+          <w:rFonts w:ascii="Calibri" w:eastAsia="Calibri" w:hAnsi="Calibri" w:cs="Calibri"/>
+        </w:rPr>
+        <w:t>, we trialled stone pile structures as physical refuges for kōura using a quasi-BACI field study</w:t>
+      </w:r>
+      <w:r>
         <w:t>.</w:t>
+      </w:r>
+      <w:r>
+        <w:rPr>
+          <w:rFonts w:ascii="Calibri" w:eastAsia="Calibri" w:hAnsi="Calibri" w:cs="Calibri"/>
+        </w:rPr>
+        <w:t xml:space="preserve"> Monitoring kōura and catfish for 18 months across stone pile, control, and reference sites, we estimated occupancy using a Bayesian framework that accounts for imperfect detection. This study provides a rare, field-based test of structural refugia as a targeted management tool against an invasive lake predator.</w:t>
       </w:r>
     </w:p>
     <w:p>
       <w:pPr>
-        <w:spacing w:before="0" w:beforeAutospacing="off" w:after="200" w:afterAutospacing="off" w:line="288" w:lineRule="auto"/>
-        <w:rPr>
-          <w:rFonts w:ascii="Calibri" w:hAnsi="Calibri" w:eastAsia="Calibri" w:cs="Calibri"/>
-          <w:noProof w:val="0"/>
-          <w:sz w:val="22"/>
-          <w:szCs w:val="22"/>
-          <w:lang w:val="en-GB"/>
-        </w:rPr>
-        <w:pPrChange w:author="Frank Burdon" w:date="2026-09-10T05:33:28.919Z">
-          <w:pPr/>
-        </w:pPrChange>
+        <w:spacing w:before="80" w:after="0"/>
+        <w:jc w:val="both"/>
       </w:pPr>
-      <w:ins w:author="Frank Burdon" w:date="2026-09-10T05:33:28.926Z" w16du:dateUtc="2026-09-10T05:33:28.926Z" w:id="1962176071">
-        <w:r>
-          <w:rPr>
-            <w:rFonts w:ascii="Calibri" w:hAnsi="Calibri" w:eastAsia="Calibri" w:cs="Calibri"/>
-            <w:noProof w:val="0"/>
-            <w:sz w:val="22"/>
-            <w:szCs w:val="22"/>
-            <w:lang w:val="en-GB"/>
-          </w:rPr>
-          <w:t xml:space="preserve">A second, related problem motivated our study design. Habitat enhancement projects are frequently implemented with little or no monitoring, and where monitoring does occur it is often too short or too coarse to distinguish a real but slow-developing effect from a true absence of effect — a well-documented limitation in the restoration literature that leaves managers unable to learn whether their interventions worked. We addressed this directly: </w:t>
-        </w:r>
-        <w:r>
-          <w:rPr>
-            <w:rFonts w:ascii="Calibri" w:hAnsi="Calibri" w:eastAsia="Calibri" w:cs="Calibri"/>
-            <w:noProof w:val="0"/>
-            <w:sz w:val="22"/>
-            <w:szCs w:val="22"/>
-            <w:lang w:val="en-GB"/>
-          </w:rPr>
-          <w:t>kōura</w:t>
-        </w:r>
-        <w:r>
-          <w:rPr>
-            <w:rFonts w:ascii="Calibri" w:hAnsi="Calibri" w:eastAsia="Calibri" w:cs="Calibri"/>
-            <w:noProof w:val="0"/>
-            <w:sz w:val="22"/>
-            <w:szCs w:val="22"/>
-            <w:lang w:val="en-GB"/>
-          </w:rPr>
-          <w:t xml:space="preserve"> and catfish were </w:t>
-        </w:r>
-        <w:r>
-          <w:rPr>
-            <w:rFonts w:ascii="Calibri" w:hAnsi="Calibri" w:eastAsia="Calibri" w:cs="Calibri"/>
-            <w:noProof w:val="0"/>
-            <w:sz w:val="22"/>
-            <w:szCs w:val="22"/>
-            <w:lang w:val="en-GB"/>
-          </w:rPr>
-          <w:t>monitored</w:t>
-        </w:r>
-        <w:r>
-          <w:rPr>
-            <w:rFonts w:ascii="Calibri" w:hAnsi="Calibri" w:eastAsia="Calibri" w:cs="Calibri"/>
-            <w:noProof w:val="0"/>
-            <w:sz w:val="22"/>
-            <w:szCs w:val="22"/>
-            <w:lang w:val="en-GB"/>
-          </w:rPr>
-          <w:t xml:space="preserve"> for 18 months at stone pile, paired control, and natural reference sites, with occupancy estimated in a Bayesian framework that explicitly accounts for imperfect detection.</w:t>
-        </w:r>
-      </w:ins>
+      <w:r>
+        <w:t>We found that refuge use by kōura was strongly seasonal,</w:t>
+      </w:r>
+      <w:r>
+        <w:rPr>
+          <w:rFonts w:ascii="Calibri" w:eastAsia="Calibri" w:hAnsi="Calibri" w:cs="Calibri"/>
+        </w:rPr>
+        <w:t xml:space="preserve"> while catfish showed no comparable attraction to the structures</w:t>
+      </w:r>
+      <w:r>
+        <w:rPr>
+          <w:rFonts w:ascii="Calibri" w:eastAsia="Calibri" w:hAnsi="Calibri" w:cs="Calibri"/>
+        </w:rPr>
+        <w:t>.</w:t>
+      </w:r>
+      <w:r>
+        <w:t xml:space="preserve"> Although effects on kōura abundance, biomass, and occupancy trended consistently positive, they did not reach statistical significance</w:t>
+      </w:r>
+      <w:r>
+        <w:t>.</w:t>
+      </w:r>
+      <w:r>
+        <w:rPr>
+          <w:rFonts w:ascii="Calibri" w:eastAsia="Calibri" w:hAnsi="Calibri" w:cs="Calibri"/>
+        </w:rPr>
+        <w:t xml:space="preserve"> Rather than treat this as an inconclusive result, we used simulation-based</w:t>
+      </w:r>
+      <w:r>
+        <w:t xml:space="preserve"> power analysis</w:t>
+      </w:r>
+      <w:r>
+        <w:rPr>
+          <w:rFonts w:ascii="Calibri" w:eastAsia="Calibri" w:hAnsi="Calibri" w:cs="Calibri"/>
+        </w:rPr>
+        <w:t xml:space="preserve"> to model the observed effect-size trajectory forward and estimate how much additional monitoring effort (in site pairs and monitoring rounds) would be needed before a treatment effect becomes statistically detectable</w:t>
+      </w:r>
+      <w:r>
+        <w:t>.</w:t>
+      </w:r>
+      <w:r>
+        <w:rPr>
+          <w:rFonts w:ascii="Calibri" w:eastAsia="Calibri" w:hAnsi="Calibri" w:cs="Calibri"/>
+        </w:rPr>
+        <w:t xml:space="preserve"> This lets us show that the result</w:t>
+      </w:r>
+      <w:r>
+        <w:rPr>
+          <w:rFonts w:ascii="Calibri" w:eastAsia="Calibri" w:hAnsi="Calibri" w:cs="Calibri"/>
+        </w:rPr>
+        <w:t xml:space="preserve"> most plausibly reflects limited study </w:t>
+      </w:r>
+      <w:r>
+        <w:rPr>
+          <w:rFonts w:ascii="Calibri" w:eastAsia="Calibri" w:hAnsi="Calibri" w:cs="Calibri"/>
+        </w:rPr>
+        <w:t xml:space="preserve">duration and sample size rather than genuine </w:t>
+      </w:r>
+      <w:r>
+        <w:rPr>
+          <w:rFonts w:ascii="Calibri" w:eastAsia="Calibri" w:hAnsi="Calibri" w:cs="Calibri"/>
+        </w:rPr>
+        <w:t>ineffective</w:t>
+      </w:r>
+      <w:r>
+        <w:rPr>
+          <w:rFonts w:ascii="Calibri" w:eastAsia="Calibri" w:hAnsi="Calibri" w:cs="Calibri"/>
+        </w:rPr>
+        <w:t xml:space="preserve">ness, </w:t>
+      </w:r>
+      <w:r>
+        <w:rPr>
+          <w:rFonts w:ascii="Calibri" w:eastAsia="Calibri" w:hAnsi="Calibri" w:cs="Calibri"/>
+        </w:rPr>
+        <w:t>and gives managers and future studies a concrete, transferable basis for scoping monitoring duration before a habitat enhancement programme begins, rather than discovering after the fact that it was underpowered.</w:t>
+      </w:r>
     </w:p>
     <w:p>
       <w:pPr>
-        <w:pStyle w:val="Normal"/>
+        <w:spacing w:before="80" w:after="0"/>
+        <w:jc w:val="both"/>
       </w:pPr>
       <w:r>
-        <w:rPr/>
-        <w:t xml:space="preserve">Effects on </w:t>
-      </w:r>
-      <w:r>
-        <w:rPr/>
-        <w:t>kōura</w:t>
-      </w:r>
-      <w:r>
-        <w:rPr/>
-        <w:t xml:space="preserve"> abundance, biomass, and occupancy trended consistently positive but did not reach statistical significance</w:t>
-      </w:r>
-      <w:del w:author="Frank Burdon" w:date="2026-09-10T05:34:28.911Z" w16du:dateUtc="2026-09-10T05:34:28.911Z" w:id="1174756378">
-        <w:r>
-          <w:delText>. A</w:delText>
-        </w:r>
-      </w:del>
-      <w:ins w:author="Frank Burdon" w:date="2026-09-10T05:34:28.927Z" w16du:dateUtc="2026-09-10T05:34:28.927Z" w:id="604297962">
-        <w:r>
-          <w:rPr>
-            <w:rFonts w:ascii="Calibri" w:hAnsi="Calibri" w:eastAsia="Calibri" w:cs="Calibri"/>
-            <w:noProof w:val="0"/>
-            <w:sz w:val="22"/>
-            <w:szCs w:val="22"/>
-            <w:lang w:val="en-GB"/>
-          </w:rPr>
-          <w:t>, while catfish showed no comparable attraction to the structures. Rather than treating this as an inconclusive result, we used simulation-based</w:t>
-        </w:r>
-      </w:ins>
-      <w:r>
-        <w:rPr/>
-        <w:t xml:space="preserve"> power analysis </w:t>
-      </w:r>
-      <w:del w:author="Frank Burdon" w:date="2026-09-10T05:35:01.877Z" w16du:dateUtc="2026-09-10T05:35:01.877Z" w:id="1670805128">
-        <w:r>
-          <w:delText>shows this reflects the study's limited scale rather than a true absence of effect</w:delText>
-        </w:r>
-      </w:del>
-      <w:ins w:author="Frank Burdon" w:date="2026-09-10T05:35:01.898Z" w16du:dateUtc="2026-09-10T05:35:01.898Z" w:id="80234477">
-        <w:r>
-          <w:rPr>
-            <w:rFonts w:ascii="Calibri" w:hAnsi="Calibri" w:eastAsia="Calibri" w:cs="Calibri"/>
-            <w:noProof w:val="0"/>
-            <w:sz w:val="22"/>
-            <w:szCs w:val="22"/>
-            <w:lang w:val="en-GB"/>
-          </w:rPr>
-          <w:t xml:space="preserve"> to model the observed effect-size trajectory forward and estimate how much additional monitoring effort (</w:t>
-        </w:r>
-        <w:r>
-          <w:rPr>
-            <w:rFonts w:ascii="Calibri" w:hAnsi="Calibri" w:eastAsia="Calibri" w:cs="Calibri"/>
-            <w:noProof w:val="0"/>
-            <w:sz w:val="22"/>
-            <w:szCs w:val="22"/>
-            <w:lang w:val="en-GB"/>
-          </w:rPr>
-          <w:t>in site pairs and monitoring rounds) would be needed before a treatment effect becomes statistically detectable</w:t>
-        </w:r>
-      </w:ins>
-      <w:r>
-        <w:rPr/>
-        <w:t xml:space="preserve">. </w:t>
-      </w:r>
-      <w:del w:author="Frank Burdon" w:date="2026-09-10T05:36:07.39Z" w16du:dateUtc="2026-09-10T05:36:07.39Z" w:id="673667442">
-        <w:r>
-          <w:delText>Kōura use of stone piles was seasonal, while catfish showed no comparable attraction to them.</w:delText>
-        </w:r>
-      </w:del>
-      <w:ins w:author="Frank Burdon" w:date="2026-09-10T05:36:10.577Z" w16du:dateUtc="2026-09-10T05:36:10.577Z" w:id="668396243">
-        <w:r>
-          <w:rPr>
-            <w:rFonts w:ascii="Calibri" w:hAnsi="Calibri" w:eastAsia="Calibri" w:cs="Calibri"/>
-            <w:noProof w:val="0"/>
-            <w:sz w:val="22"/>
-            <w:szCs w:val="22"/>
-            <w:lang w:val="en-GB"/>
-          </w:rPr>
-          <w:t xml:space="preserve"> This lets us show that the result is consistent with a genuine, developing effect rather than an ineffective intervention, and gives managers and future studies a concrete, transferable basis for scoping monitoring duration before a habitat enhancement programme begins, rather than discovering after the fact that it was underpowered.</w:t>
-        </w:r>
-      </w:ins>
-      <w:r>
-        <w:rPr/>
-        <w:t xml:space="preserve"> Beyond these ecological findings, the study </w:t>
-      </w:r>
-      <w:ins w:author="Frank Burdon" w:date="2026-09-10T05:36:19.12Z" w16du:dateUtc="2026-09-10T05:36:19.12Z" w:id="1964092964">
-        <w:r>
-          <w:t xml:space="preserve">also </w:t>
-        </w:r>
-      </w:ins>
-      <w:r>
-        <w:rPr/>
-        <w:t>established</w:t>
-      </w:r>
-      <w:r>
-        <w:rPr/>
+        <w:t>Another practical outcome of the</w:t>
+      </w:r>
+      <w:r>
+        <w:t xml:space="preserve"> study </w:t>
+      </w:r>
+      <w:r>
+        <w:t>was</w:t>
+      </w:r>
+      <w:r>
+        <w:t xml:space="preserve"> </w:t>
+      </w:r>
+      <w:r>
+        <w:t>establish</w:t>
+      </w:r>
+      <w:r>
+        <w:t>ing</w:t>
+      </w:r>
+      <w:r>
         <w:t xml:space="preserve"> a tested, scalable construction method that lake managers can apply directly.</w:t>
+      </w:r>
+      <w:r>
+        <w:t xml:space="preserve"> </w:t>
+      </w:r>
+      <w:r>
+        <w:t>We observed that</w:t>
+      </w:r>
+      <w:r>
+        <w:t xml:space="preserve"> kōura</w:t>
+      </w:r>
+      <w:r>
+        <w:t xml:space="preserve"> </w:t>
+      </w:r>
+      <w:r>
+        <w:t>use of the refuges</w:t>
+      </w:r>
+      <w:r>
+        <w:t xml:space="preserve"> peak</w:t>
+      </w:r>
+      <w:r>
+        <w:t>ed</w:t>
+      </w:r>
+      <w:r>
+        <w:t xml:space="preserve"> when habitat compression and predation pressure aligned most severely, a pattern likely relevant to other systems where predator and habitat pressures </w:t>
+      </w:r>
+      <w:r>
+        <w:t>converge</w:t>
+      </w:r>
+      <w:r>
+        <w:t xml:space="preserve"> seasonally.</w:t>
+      </w:r>
+      <w:r>
+        <w:t xml:space="preserve"> Ultimately, these results suggest that habitat enhancement strategies in similarly stressed ecosystems should be timed and targeted to anticipate seasonal</w:t>
+      </w:r>
+      <w:r>
+        <w:t>ity</w:t>
+      </w:r>
+      <w:r>
+        <w:t xml:space="preserve">, rather than evaluated solely on </w:t>
+      </w:r>
+      <w:r>
+        <w:t>single sampling efforts or yearly averages</w:t>
+      </w:r>
+      <w:r>
+        <w:t>.</w:t>
       </w:r>
     </w:p>
     <w:p>
       <w:pPr>
-        <w:pStyle w:val="Normal"/>
+        <w:spacing w:before="80" w:after="0"/>
+        <w:jc w:val="both"/>
       </w:pPr>
       <w:r>
-        <w:rPr/>
         <w:t xml:space="preserve">We believe this manuscript fits the aims and scope of the </w:t>
       </w:r>
       <w:r>
         <w:rPr>
-          <w:i w:val="1"/>
-          <w:iCs w:val="1"/>
+          <w:i/>
+          <w:iCs/>
         </w:rPr>
         <w:t>Journal of Applied Ecology</w:t>
       </w:r>
       <w:r>
-        <w:rPr/>
         <w:t xml:space="preserve"> well</w:t>
       </w:r>
-      <w:ins w:author="Frank Burdon" w:date="2026-09-10T05:36:35.294Z" w16du:dateUtc="2026-09-10T05:36:35.294Z" w:id="1147552172">
-        <w:r>
-          <w:t>.</w:t>
-        </w:r>
-      </w:ins>
-      <w:del w:author="Frank Burdon" w:date="2026-09-10T05:36:35.035Z" w16du:dateUtc="2026-09-10T05:36:35.035Z" w:id="816846908">
-        <w:r>
-          <w:delText>,</w:delText>
-        </w:r>
-      </w:del>
-      <w:r>
-        <w:rPr/>
+      <w:r>
+        <w:t>.</w:t>
+      </w:r>
+      <w:r>
         <w:t xml:space="preserve"> </w:t>
       </w:r>
-      <w:del w:author="Frank Burdon" w:date="2026-09-10T05:36:59.425Z" w16du:dateUtc="2026-09-10T05:36:59.425Z" w:id="419390019">
-        <w:r>
-          <w:delText xml:space="preserve">as it uses ecological science to inform management of a species under pressure from multiple stressors. It tests a concrete intervention that managers can deploy where the underlying stressors cannot be </w:delText>
-        </w:r>
-        <w:r>
-          <w:delText>removed and</w:delText>
-        </w:r>
-        <w:r>
-          <w:delText xml:space="preserve"> provides a power-analysis-grounded reason for the non-significant result that is directly relevant to the design of future habitat enhancement monitoring programmes</w:delText>
-        </w:r>
-      </w:del>
-      <w:ins w:author="Frank Burdon" w:date="2026-09-10T05:36:59.441Z" w16du:dateUtc="2026-09-10T05:36:59.441Z" w:id="771437632">
-        <w:r>
-          <w:rPr>
-            <w:rFonts w:ascii="Calibri" w:hAnsi="Calibri" w:eastAsia="Calibri" w:cs="Calibri"/>
-            <w:noProof w:val="0"/>
-            <w:sz w:val="22"/>
-            <w:szCs w:val="22"/>
-            <w:lang w:val="en-GB"/>
-          </w:rPr>
-          <w:t>It reports one of the first field trials of structural habitat enhancement for a threatened species in a lake, in a system where the underlying stressors cannot be removed; it directly addresses the well-known shortfall in monitoring of restoration interventions through a rigorous, multi-site design; and it offers a power-analysis framework that other practitioners can apply when designing monitoring for their own restoration programmes, extending the paper's relevance beyond this one system</w:t>
-        </w:r>
-      </w:ins>
-      <w:r>
-        <w:rPr/>
+      <w:r>
+        <w:rPr>
+          <w:rFonts w:ascii="Calibri" w:eastAsia="Calibri" w:hAnsi="Calibri" w:cs="Calibri"/>
+        </w:rPr>
+        <w:t xml:space="preserve">It reports one of the first field trials of structural habitat enhancement for a threatened species </w:t>
+      </w:r>
+      <w:r>
+        <w:rPr>
+          <w:rFonts w:ascii="Calibri" w:eastAsia="Calibri" w:hAnsi="Calibri" w:cs="Calibri"/>
+        </w:rPr>
+        <w:t>against</w:t>
+      </w:r>
+      <w:r>
+        <w:rPr>
+          <w:rFonts w:ascii="Calibri" w:eastAsia="Calibri" w:hAnsi="Calibri" w:cs="Calibri"/>
+        </w:rPr>
+        <w:t xml:space="preserve"> </w:t>
+      </w:r>
+      <w:r>
+        <w:rPr>
+          <w:rFonts w:ascii="Calibri" w:eastAsia="Calibri" w:hAnsi="Calibri" w:cs="Calibri"/>
+        </w:rPr>
+        <w:t xml:space="preserve">an </w:t>
+      </w:r>
+      <w:r>
+        <w:rPr>
+          <w:rFonts w:ascii="Calibri" w:eastAsia="Calibri" w:hAnsi="Calibri" w:cs="Calibri"/>
+        </w:rPr>
+        <w:t>invasive</w:t>
+      </w:r>
+      <w:r>
+        <w:rPr>
+          <w:rFonts w:ascii="Calibri" w:eastAsia="Calibri" w:hAnsi="Calibri" w:cs="Calibri"/>
+        </w:rPr>
+        <w:t xml:space="preserve"> </w:t>
+      </w:r>
+      <w:r>
+        <w:rPr>
+          <w:rFonts w:ascii="Calibri" w:eastAsia="Calibri" w:hAnsi="Calibri" w:cs="Calibri"/>
+        </w:rPr>
+        <w:t>predator</w:t>
+      </w:r>
+      <w:r>
+        <w:rPr>
+          <w:rFonts w:ascii="Calibri" w:eastAsia="Calibri" w:hAnsi="Calibri" w:cs="Calibri"/>
+        </w:rPr>
+        <w:t xml:space="preserve"> </w:t>
+      </w:r>
+      <w:r>
+        <w:rPr>
+          <w:rFonts w:ascii="Calibri" w:eastAsia="Calibri" w:hAnsi="Calibri" w:cs="Calibri"/>
+        </w:rPr>
+        <w:t>in a</w:t>
+      </w:r>
+      <w:r>
+        <w:rPr>
+          <w:rFonts w:ascii="Calibri" w:eastAsia="Calibri" w:hAnsi="Calibri" w:cs="Calibri"/>
+        </w:rPr>
+        <w:t xml:space="preserve"> </w:t>
+      </w:r>
+      <w:r>
+        <w:rPr>
+          <w:rFonts w:ascii="Calibri" w:eastAsia="Calibri" w:hAnsi="Calibri" w:cs="Calibri"/>
+        </w:rPr>
+        <w:t xml:space="preserve">lake </w:t>
+      </w:r>
+      <w:r>
+        <w:rPr>
+          <w:rFonts w:ascii="Calibri" w:eastAsia="Calibri" w:hAnsi="Calibri" w:cs="Calibri"/>
+        </w:rPr>
+        <w:t>system</w:t>
+      </w:r>
+      <w:r>
+        <w:rPr>
+          <w:rFonts w:ascii="Calibri" w:eastAsia="Calibri" w:hAnsi="Calibri" w:cs="Calibri"/>
+        </w:rPr>
+        <w:t>; it directly addresses the well-known shortfall in monitoring of restoration interventions through a rigorous, multi-site design; and it offers a power-analysis framework that other practitioners can apply when designing monitoring for their own restoration programmes, extending the paper's relevance beyond this one system</w:t>
+      </w:r>
+      <w:r>
         <w:t>.</w:t>
-      </w:r>
-    </w:p>
-    <w:p>
-      <w:r>
-        <w:t>This manuscript has not been published previously and is not under consideration elsewhere. All authors have approved the manuscript and agree with its submission. We have no conflicts of interest to declare.</w:t>
-      </w:r>
-    </w:p>
-    <w:p>
-      <w:r>
-        <w:t>Thank you for considering our manuscript. We look forward to your response.</w:t>
-      </w:r>
-    </w:p>
-    <w:p>
-      <w:r>
-        <w:t xml:space="preserve">On </w:t>
-      </w:r>
-      <w:r>
-        <w:t>behalf</w:t>
-      </w:r>
-      <w:r>
-        <w:t xml:space="preserve"> of all authors,</w:t>
       </w:r>
     </w:p>
     <w:p>
       <w:pPr>
-        <w:rPr>
-          <w:del w:author="Frank Burdon" w:date="2026-09-10T05:38:48.243Z" w16du:dateUtc="2026-09-10T05:38:48.243Z" w:id="1870233270"/>
-        </w:rPr>
+        <w:spacing w:before="80" w:after="0"/>
+        <w:jc w:val="both"/>
       </w:pPr>
       <w:r>
-        <w:rPr/>
+        <w:t>This manuscript has not been published previously and is not under consideration elsewhere. All authors have approved the manuscript and agree with its submission. We have no conflicts of interest to declare.</w:t>
+      </w:r>
+    </w:p>
+    <w:p>
+      <w:pPr>
+        <w:spacing w:before="80" w:after="0"/>
+        <w:jc w:val="both"/>
+      </w:pPr>
+      <w:r>
+        <w:t>Thank you for considering our manuscript. We look forward to your response.</w:t>
+      </w:r>
+    </w:p>
+    <w:p>
+      <w:pPr>
+        <w:spacing w:before="120" w:after="0"/>
+        <w:jc w:val="both"/>
+      </w:pPr>
+      <w:r>
+        <w:t xml:space="preserve">On </w:t>
+      </w:r>
+      <w:r>
+        <w:t>behalf</w:t>
+      </w:r>
+      <w:r>
+        <w:t xml:space="preserve"> of all authors,</w:t>
+      </w:r>
+    </w:p>
+    <w:p>
+      <w:pPr>
+        <w:spacing w:before="120" w:after="0"/>
+        <w:jc w:val="both"/>
+      </w:pPr>
+      <w:r>
         <w:t>Olivier Raven</w:t>
       </w:r>
     </w:p>
-    <w:p/>
-    <w:p/>
     <w:sectPr>
-      <w:pgSz w:w="11906" w:h="16838" w:orient="portrait"/>
-      <w:pgMar w:top="1440" w:right="1296" w:bottom="1440" w:left="1296" w:header="708" w:footer="708" w:gutter="0"/>
+      <w:pgSz w:w="11906" w:h="16838"/>
+      <w:pgMar w:top="1134" w:right="1134" w:bottom="1134" w:left="1134" w:header="709" w:footer="709" w:gutter="0"/>
       <w:cols w:space="708"/>
       <w:docGrid w:linePitch="360"/>
     </w:sectPr>
@@ -517,72 +660,12 @@
 </w:document>
 </file>
 
-<file path=word/comments.xml><?xml version="1.0" encoding="utf-8"?>
-<w:comments xmlns:w14="http://schemas.microsoft.com/office/word/2010/wordml" xmlns:w="http://schemas.openxmlformats.org/wordprocessingml/2006/main">
-  <w:comment xmlns:w="http://schemas.openxmlformats.org/wordprocessingml/2006/main" w:initials="FB" w:author="Frank Burdon" w:date="2026-09-10T17:45:21" w:id="1087078760">
-    <w:p xmlns:w14="http://schemas.microsoft.com/office/word/2010/wordml" xmlns:w="http://schemas.openxmlformats.org/wordprocessingml/2006/main">
-      <w:pPr>
-        <w:pStyle w:val="CommentText"/>
-      </w:pPr>
-      <w:r>
-        <w:rPr>
-          <w:rStyle w:val="CommentReference"/>
-        </w:rPr>
-        <w:annotationRef/>
-      </w:r>
-      <w:r>
-        <w:t>Could go for a declarative title:</w:t>
-      </w:r>
-    </w:p>
-    <w:p xmlns:w14="http://schemas.microsoft.com/office/word/2010/wordml" xmlns:w="http://schemas.openxmlformats.org/wordprocessingml/2006/main">
-      <w:pPr>
-        <w:pStyle w:val="CommentText"/>
-      </w:pPr>
-    </w:p>
-    <w:p xmlns:w14="http://schemas.microsoft.com/office/word/2010/wordml" xmlns:w="http://schemas.openxmlformats.org/wordprocessingml/2006/main">
-      <w:pPr>
-        <w:pStyle w:val="CommentText"/>
-      </w:pPr>
-      <w:r>
-        <w:t>"Stone pile refuges in an Aotearoa New Zealand lake: early benefits for threatened crayfish but not their invasive predator"</w:t>
-      </w:r>
-    </w:p>
-  </w:comment>
-</w:comments>
-</file>
-
-<file path=word/commentsExtended.xml><?xml version="1.0" encoding="utf-8"?>
-<w15:commentsEx xmlns:mc="http://schemas.openxmlformats.org/markup-compatibility/2006" xmlns:w15="http://schemas.microsoft.com/office/word/2012/wordml" mc:Ignorable="w15">
-  <w15:commentEx w15:done="0" w15:paraId="5E900928"/>
-</w15:commentsEx>
-</file>
-
-<file path=word/commentsExtensible.xml><?xml version="1.0" encoding="utf-8"?>
-<w16cex:commentsExtensible xmlns:w16="http://schemas.microsoft.com/office/word/2018/wordml" xmlns:w16cex="http://schemas.microsoft.com/office/word/2018/wordml/cex" xmlns:mc="http://schemas.openxmlformats.org/markup-compatibility/2006" mc:Ignorable="w16 w16cex">
-  <w16cex:commentExtensible w16cex:durableId="7AE660D1" w16cex:dateUtc="2026-09-10T05:45:21.095Z"/>
-</w16cex:commentsExtensible>
-</file>
-
-<file path=word/commentsIds.xml><?xml version="1.0" encoding="utf-8"?>
-<w16cid:commentsIds xmlns:mc="http://schemas.openxmlformats.org/markup-compatibility/2006" xmlns:w16cid="http://schemas.microsoft.com/office/word/2016/wordml/cid" mc:Ignorable="w16cid">
-  <w16cid:commentId w16cid:paraId="5E900928" w16cid:durableId="7AE660D1"/>
-</w16cid:commentsIds>
-</file>
-
-<file path=word/people.xml><?xml version="1.0" encoding="utf-8"?>
-<w15:people xmlns:mc="http://schemas.openxmlformats.org/markup-compatibility/2006" xmlns:w15="http://schemas.microsoft.com/office/word/2012/wordml" mc:Ignorable="w15">
-  <w15:person w15:author="Frank Burdon">
-    <w15:presenceInfo w15:providerId="AD" w15:userId="S::frank.burdon@waikato.ac.nz::266a3963-8d8e-4a25-8b9d-09f4644bb8d2"/>
-  </w15:person>
-</w15:people>
-</file>
-
 <file path=word/styles.xml><?xml version="1.0" encoding="utf-8"?>
 <w:styles xmlns:mc="http://schemas.openxmlformats.org/markup-compatibility/2006" xmlns:r="http://schemas.openxmlformats.org/officeDocument/2006/relationships" xmlns:w="http://schemas.openxmlformats.org/wordprocessingml/2006/main" xmlns:w14="http://schemas.microsoft.com/office/word/2010/wordml" xmlns:w15="http://schemas.microsoft.com/office/word/2012/wordml" xmlns:w16cex="http://schemas.microsoft.com/office/word/2018/wordml/cex" xmlns:w16cid="http://schemas.microsoft.com/office/word/2016/wordml/cid" xmlns:w16="http://schemas.microsoft.com/office/word/2018/wordml" xmlns:w16du="http://schemas.microsoft.com/office/word/2023/wordml/word16du" xmlns:w16sdtdh="http://schemas.microsoft.com/office/word/2020/wordml/sdtdatahash" xmlns:w16sdtfl="http://schemas.microsoft.com/office/word/2024/wordml/sdtformatlock" xmlns:w16se="http://schemas.microsoft.com/office/word/2015/wordml/symex" mc:Ignorable="w14 w15 w16se w16cid w16 w16cex w16sdtdh w16sdtfl w16du">
   <w:docDefaults>
     <w:rPrDefault>
       <w:rPr>
-        <w:rFonts w:asciiTheme="minorHAnsi" w:hAnsiTheme="minorHAnsi" w:eastAsiaTheme="minorHAnsi" w:cstheme="minorBidi"/>
+        <w:rFonts w:asciiTheme="minorHAnsi" w:eastAsiaTheme="minorHAnsi" w:hAnsiTheme="minorHAnsi" w:cstheme="minorBidi"/>
         <w:kern w:val="2"/>
         <w:sz w:val="22"/>
         <w:szCs w:val="22"/>
@@ -599,14 +682,14 @@
   <w:latentStyles w:defLockedState="0" w:defUIPriority="99" w:defSemiHidden="0" w:defUnhideWhenUsed="0" w:defQFormat="0" w:count="376">
     <w:lsdException w:name="Normal" w:uiPriority="0" w:qFormat="1"/>
     <w:lsdException w:name="heading 1" w:uiPriority="9" w:qFormat="1"/>
-    <w:lsdException w:name="heading 2" w:uiPriority="9" w:semiHidden="1" w:unhideWhenUsed="1" w:qFormat="1"/>
-    <w:lsdException w:name="heading 3" w:uiPriority="9" w:semiHidden="1" w:unhideWhenUsed="1" w:qFormat="1"/>
-    <w:lsdException w:name="heading 4" w:uiPriority="9" w:semiHidden="1" w:unhideWhenUsed="1" w:qFormat="1"/>
-    <w:lsdException w:name="heading 5" w:uiPriority="9" w:semiHidden="1" w:unhideWhenUsed="1" w:qFormat="1"/>
-    <w:lsdException w:name="heading 6" w:uiPriority="9" w:semiHidden="1" w:unhideWhenUsed="1" w:qFormat="1"/>
-    <w:lsdException w:name="heading 7" w:uiPriority="9" w:semiHidden="1" w:unhideWhenUsed="1" w:qFormat="1"/>
-    <w:lsdException w:name="heading 8" w:uiPriority="9" w:semiHidden="1" w:unhideWhenUsed="1" w:qFormat="1"/>
-    <w:lsdException w:name="heading 9" w:uiPriority="9" w:semiHidden="1" w:unhideWhenUsed="1" w:qFormat="1"/>
+    <w:lsdException w:name="heading 2" w:semiHidden="1" w:uiPriority="9" w:unhideWhenUsed="1" w:qFormat="1"/>
+    <w:lsdException w:name="heading 3" w:semiHidden="1" w:uiPriority="9" w:unhideWhenUsed="1" w:qFormat="1"/>
+    <w:lsdException w:name="heading 4" w:semiHidden="1" w:uiPriority="9" w:unhideWhenUsed="1" w:qFormat="1"/>
+    <w:lsdException w:name="heading 5" w:semiHidden="1" w:uiPriority="9" w:unhideWhenUsed="1" w:qFormat="1"/>
+    <w:lsdException w:name="heading 6" w:semiHidden="1" w:uiPriority="9" w:unhideWhenUsed="1" w:qFormat="1"/>
+    <w:lsdException w:name="heading 7" w:semiHidden="1" w:uiPriority="9" w:unhideWhenUsed="1" w:qFormat="1"/>
+    <w:lsdException w:name="heading 8" w:semiHidden="1" w:uiPriority="9" w:unhideWhenUsed="1" w:qFormat="1"/>
+    <w:lsdException w:name="heading 9" w:semiHidden="1" w:uiPriority="9" w:unhideWhenUsed="1" w:qFormat="1"/>
     <w:lsdException w:name="index 1" w:semiHidden="1" w:unhideWhenUsed="1"/>
     <w:lsdException w:name="index 2" w:semiHidden="1" w:unhideWhenUsed="1"/>
     <w:lsdException w:name="index 3" w:semiHidden="1" w:unhideWhenUsed="1"/>
@@ -616,22 +699,22 @@
     <w:lsdException w:name="index 7" w:semiHidden="1" w:unhideWhenUsed="1"/>
     <w:lsdException w:name="index 8" w:semiHidden="1" w:unhideWhenUsed="1"/>
     <w:lsdException w:name="index 9" w:semiHidden="1" w:unhideWhenUsed="1"/>
-    <w:lsdException w:name="toc 1" w:uiPriority="39" w:semiHidden="1" w:unhideWhenUsed="1"/>
-    <w:lsdException w:name="toc 2" w:uiPriority="39" w:semiHidden="1" w:unhideWhenUsed="1"/>
-    <w:lsdException w:name="toc 3" w:uiPriority="39" w:semiHidden="1" w:unhideWhenUsed="1"/>
-    <w:lsdException w:name="toc 4" w:uiPriority="39" w:semiHidden="1" w:unhideWhenUsed="1"/>
-    <w:lsdException w:name="toc 5" w:uiPriority="39" w:semiHidden="1" w:unhideWhenUsed="1"/>
-    <w:lsdException w:name="toc 6" w:uiPriority="39" w:semiHidden="1" w:unhideWhenUsed="1"/>
-    <w:lsdException w:name="toc 7" w:uiPriority="39" w:semiHidden="1" w:unhideWhenUsed="1"/>
-    <w:lsdException w:name="toc 8" w:uiPriority="39" w:semiHidden="1" w:unhideWhenUsed="1"/>
-    <w:lsdException w:name="toc 9" w:uiPriority="39" w:semiHidden="1" w:unhideWhenUsed="1"/>
+    <w:lsdException w:name="toc 1" w:semiHidden="1" w:uiPriority="39" w:unhideWhenUsed="1"/>
+    <w:lsdException w:name="toc 2" w:semiHidden="1" w:uiPriority="39" w:unhideWhenUsed="1"/>
+    <w:lsdException w:name="toc 3" w:semiHidden="1" w:uiPriority="39" w:unhideWhenUsed="1"/>
+    <w:lsdException w:name="toc 4" w:semiHidden="1" w:uiPriority="39" w:unhideWhenUsed="1"/>
+    <w:lsdException w:name="toc 5" w:semiHidden="1" w:uiPriority="39" w:unhideWhenUsed="1"/>
+    <w:lsdException w:name="toc 6" w:semiHidden="1" w:uiPriority="39" w:unhideWhenUsed="1"/>
+    <w:lsdException w:name="toc 7" w:semiHidden="1" w:uiPriority="39" w:unhideWhenUsed="1"/>
+    <w:lsdException w:name="toc 8" w:semiHidden="1" w:uiPriority="39" w:unhideWhenUsed="1"/>
+    <w:lsdException w:name="toc 9" w:semiHidden="1" w:uiPriority="39" w:unhideWhenUsed="1"/>
     <w:lsdException w:name="Normal Indent" w:semiHidden="1" w:unhideWhenUsed="1"/>
     <w:lsdException w:name="footnote text" w:semiHidden="1" w:unhideWhenUsed="1"/>
     <w:lsdException w:name="annotation text" w:semiHidden="1" w:unhideWhenUsed="1"/>
     <w:lsdException w:name="header" w:semiHidden="1" w:unhideWhenUsed="1"/>
     <w:lsdException w:name="footer" w:semiHidden="1" w:unhideWhenUsed="1"/>
     <w:lsdException w:name="index heading" w:semiHidden="1" w:unhideWhenUsed="1"/>
-    <w:lsdException w:name="caption" w:uiPriority="35" w:semiHidden="1" w:unhideWhenUsed="1" w:qFormat="1"/>
+    <w:lsdException w:name="caption" w:semiHidden="1" w:uiPriority="35" w:unhideWhenUsed="1" w:qFormat="1"/>
     <w:lsdException w:name="table of figures" w:semiHidden="1" w:unhideWhenUsed="1"/>
     <w:lsdException w:name="envelope address" w:semiHidden="1" w:unhideWhenUsed="1"/>
     <w:lsdException w:name="envelope return" w:semiHidden="1" w:unhideWhenUsed="1"/>
@@ -662,7 +745,7 @@
     <w:lsdException w:name="Title" w:uiPriority="10" w:qFormat="1"/>
     <w:lsdException w:name="Closing" w:semiHidden="1" w:unhideWhenUsed="1"/>
     <w:lsdException w:name="Signature" w:semiHidden="1" w:unhideWhenUsed="1"/>
-    <w:lsdException w:name="Default Paragraph Font" w:uiPriority="1" w:semiHidden="1" w:unhideWhenUsed="1"/>
+    <w:lsdException w:name="Default Paragraph Font" w:semiHidden="1" w:uiPriority="1" w:unhideWhenUsed="1"/>
     <w:lsdException w:name="Body Text" w:semiHidden="1" w:unhideWhenUsed="1"/>
     <w:lsdException w:name="Body Text Indent" w:semiHidden="1" w:unhideWhenUsed="1"/>
     <w:lsdException w:name="List Continue" w:semiHidden="1" w:unhideWhenUsed="1"/>
@@ -862,8 +945,8 @@
     <w:lsdException w:name="Subtle Reference" w:uiPriority="31" w:qFormat="1"/>
     <w:lsdException w:name="Intense Reference" w:uiPriority="32" w:qFormat="1"/>
     <w:lsdException w:name="Book Title" w:uiPriority="33" w:qFormat="1"/>
-    <w:lsdException w:name="Bibliography" w:uiPriority="37" w:semiHidden="1" w:unhideWhenUsed="1"/>
-    <w:lsdException w:name="TOC Heading" w:uiPriority="39" w:semiHidden="1" w:unhideWhenUsed="1" w:qFormat="1"/>
+    <w:lsdException w:name="Bibliography" w:semiHidden="1" w:uiPriority="37" w:unhideWhenUsed="1"/>
+    <w:lsdException w:name="TOC Heading" w:semiHidden="1" w:uiPriority="39" w:unhideWhenUsed="1" w:qFormat="1"/>
     <w:lsdException w:name="Plain Table 1" w:uiPriority="41"/>
     <w:lsdException w:name="Plain Table 2" w:uiPriority="42"/>
     <w:lsdException w:name="Plain Table 3" w:uiPriority="43"/>
@@ -974,7 +1057,7 @@
     <w:lsdException w:name="Unresolved Mention" w:semiHidden="1" w:unhideWhenUsed="1"/>
     <w:lsdException w:name="Smart Link" w:semiHidden="1" w:unhideWhenUsed="1"/>
   </w:latentStyles>
-  <w:style w:type="paragraph" w:styleId="Normal" w:default="1">
+  <w:style w:type="paragraph" w:default="1" w:styleId="Normal">
     <w:name w:val="Normal"/>
     <w:qFormat/>
     <w:rPr>
@@ -996,7 +1079,7 @@
       <w:outlineLvl w:val="0"/>
     </w:pPr>
     <w:rPr>
-      <w:rFonts w:asciiTheme="majorHAnsi" w:hAnsiTheme="majorHAnsi" w:eastAsiaTheme="majorEastAsia" w:cstheme="majorBidi"/>
+      <w:rFonts w:asciiTheme="majorHAnsi" w:eastAsiaTheme="majorEastAsia" w:hAnsiTheme="majorHAnsi" w:cstheme="majorBidi"/>
       <w:color w:val="2F5496" w:themeColor="accent1" w:themeShade="BF"/>
       <w:sz w:val="40"/>
       <w:szCs w:val="40"/>
@@ -1019,7 +1102,7 @@
       <w:outlineLvl w:val="1"/>
     </w:pPr>
     <w:rPr>
-      <w:rFonts w:asciiTheme="majorHAnsi" w:hAnsiTheme="majorHAnsi" w:eastAsiaTheme="majorEastAsia" w:cstheme="majorBidi"/>
+      <w:rFonts w:asciiTheme="majorHAnsi" w:eastAsiaTheme="majorEastAsia" w:hAnsiTheme="majorHAnsi" w:cstheme="majorBidi"/>
       <w:color w:val="2F5496" w:themeColor="accent1" w:themeShade="BF"/>
       <w:sz w:val="32"/>
       <w:szCs w:val="32"/>
@@ -1180,12 +1263,13 @@
       <w:color w:val="272727" w:themeColor="text1" w:themeTint="D8"/>
     </w:rPr>
   </w:style>
-  <w:style w:type="character" w:styleId="DefaultParagraphFont" w:default="1">
+  <w:style w:type="character" w:default="1" w:styleId="DefaultParagraphFont">
     <w:name w:val="Default Paragraph Font"/>
     <w:uiPriority w:val="1"/>
+    <w:semiHidden/>
     <w:unhideWhenUsed/>
   </w:style>
-  <w:style w:type="table" w:styleId="TableNormal" w:default="1">
+  <w:style w:type="table" w:default="1" w:styleId="TableNormal">
     <w:name w:val="Normal Table"/>
     <w:uiPriority w:val="99"/>
     <w:semiHidden/>
@@ -1200,27 +1284,27 @@
       </w:tblCellMar>
     </w:tblPr>
   </w:style>
-  <w:style w:type="numbering" w:styleId="NoList" w:default="1">
+  <w:style w:type="numbering" w:default="1" w:styleId="NoList">
     <w:name w:val="No List"/>
     <w:uiPriority w:val="99"/>
     <w:semiHidden/>
     <w:unhideWhenUsed/>
   </w:style>
-  <w:style w:type="character" w:styleId="Heading1Char" w:customStyle="1">
+  <w:style w:type="character" w:customStyle="1" w:styleId="Heading1Char">
     <w:name w:val="Heading 1 Char"/>
     <w:basedOn w:val="DefaultParagraphFont"/>
     <w:link w:val="Heading1"/>
     <w:uiPriority w:val="9"/>
     <w:rsid w:val="00A470D6"/>
     <w:rPr>
-      <w:rFonts w:asciiTheme="majorHAnsi" w:hAnsiTheme="majorHAnsi" w:eastAsiaTheme="majorEastAsia" w:cstheme="majorBidi"/>
+      <w:rFonts w:asciiTheme="majorHAnsi" w:eastAsiaTheme="majorEastAsia" w:hAnsiTheme="majorHAnsi" w:cstheme="majorBidi"/>
       <w:color w:val="2F5496" w:themeColor="accent1" w:themeShade="BF"/>
       <w:sz w:val="40"/>
       <w:szCs w:val="40"/>
       <w:lang w:val="en-GB"/>
     </w:rPr>
   </w:style>
-  <w:style w:type="character" w:styleId="Heading2Char" w:customStyle="1">
+  <w:style w:type="character" w:customStyle="1" w:styleId="Heading2Char">
     <w:name w:val="Heading 2 Char"/>
     <w:basedOn w:val="DefaultParagraphFont"/>
     <w:link w:val="Heading2"/>
@@ -1228,14 +1312,14 @@
     <w:semiHidden/>
     <w:rsid w:val="00A470D6"/>
     <w:rPr>
-      <w:rFonts w:asciiTheme="majorHAnsi" w:hAnsiTheme="majorHAnsi" w:eastAsiaTheme="majorEastAsia" w:cstheme="majorBidi"/>
+      <w:rFonts w:asciiTheme="majorHAnsi" w:eastAsiaTheme="majorEastAsia" w:hAnsiTheme="majorHAnsi" w:cstheme="majorBidi"/>
       <w:color w:val="2F5496" w:themeColor="accent1" w:themeShade="BF"/>
       <w:sz w:val="32"/>
       <w:szCs w:val="32"/>
       <w:lang w:val="en-GB"/>
     </w:rPr>
   </w:style>
-  <w:style w:type="character" w:styleId="Heading3Char" w:customStyle="1">
+  <w:style w:type="character" w:customStyle="1" w:styleId="Heading3Char">
     <w:name w:val="Heading 3 Char"/>
     <w:basedOn w:val="DefaultParagraphFont"/>
     <w:link w:val="Heading3"/>
@@ -1250,7 +1334,7 @@
       <w:lang w:val="en-GB"/>
     </w:rPr>
   </w:style>
-  <w:style w:type="character" w:styleId="Heading4Char" w:customStyle="1">
+  <w:style w:type="character" w:customStyle="1" w:styleId="Heading4Char">
     <w:name w:val="Heading 4 Char"/>
     <w:basedOn w:val="DefaultParagraphFont"/>
     <w:link w:val="Heading4"/>
@@ -1265,7 +1349,7 @@
       <w:lang w:val="en-GB"/>
     </w:rPr>
   </w:style>
-  <w:style w:type="character" w:styleId="Heading5Char" w:customStyle="1">
+  <w:style w:type="character" w:customStyle="1" w:styleId="Heading5Char">
     <w:name w:val="Heading 5 Char"/>
     <w:basedOn w:val="DefaultParagraphFont"/>
     <w:link w:val="Heading5"/>
@@ -1278,7 +1362,7 @@
       <w:lang w:val="en-GB"/>
     </w:rPr>
   </w:style>
-  <w:style w:type="character" w:styleId="Heading6Char" w:customStyle="1">
+  <w:style w:type="character" w:customStyle="1" w:styleId="Heading6Char">
     <w:name w:val="Heading 6 Char"/>
     <w:basedOn w:val="DefaultParagraphFont"/>
     <w:link w:val="Heading6"/>
@@ -1293,7 +1377,7 @@
       <w:lang w:val="en-GB"/>
     </w:rPr>
   </w:style>
-  <w:style w:type="character" w:styleId="Heading7Char" w:customStyle="1">
+  <w:style w:type="character" w:customStyle="1" w:styleId="Heading7Char">
     <w:name w:val="Heading 7 Char"/>
     <w:basedOn w:val="DefaultParagraphFont"/>
     <w:link w:val="Heading7"/>
@@ -1306,7 +1390,7 @@
       <w:lang w:val="en-GB"/>
     </w:rPr>
   </w:style>
-  <w:style w:type="character" w:styleId="Heading8Char" w:customStyle="1">
+  <w:style w:type="character" w:customStyle="1" w:styleId="Heading8Char">
     <w:name w:val="Heading 8 Char"/>
     <w:basedOn w:val="DefaultParagraphFont"/>
     <w:link w:val="Heading8"/>
@@ -1321,7 +1405,7 @@
       <w:lang w:val="en-GB"/>
     </w:rPr>
   </w:style>
-  <w:style w:type="character" w:styleId="Heading9Char" w:customStyle="1">
+  <w:style w:type="character" w:customStyle="1" w:styleId="Heading9Char">
     <w:name w:val="Heading 9 Char"/>
     <w:basedOn w:val="DefaultParagraphFont"/>
     <w:link w:val="Heading9"/>
@@ -1347,21 +1431,21 @@
       <w:contextualSpacing/>
     </w:pPr>
     <w:rPr>
-      <w:rFonts w:asciiTheme="majorHAnsi" w:hAnsiTheme="majorHAnsi" w:eastAsiaTheme="majorEastAsia" w:cstheme="majorBidi"/>
+      <w:rFonts w:asciiTheme="majorHAnsi" w:eastAsiaTheme="majorEastAsia" w:hAnsiTheme="majorHAnsi" w:cstheme="majorBidi"/>
       <w:spacing w:val="-10"/>
       <w:kern w:val="28"/>
       <w:sz w:val="56"/>
       <w:szCs w:val="56"/>
     </w:rPr>
   </w:style>
-  <w:style w:type="character" w:styleId="TitleChar" w:customStyle="1">
+  <w:style w:type="character" w:customStyle="1" w:styleId="TitleChar">
     <w:name w:val="Title Char"/>
     <w:basedOn w:val="DefaultParagraphFont"/>
     <w:link w:val="Title"/>
     <w:uiPriority w:val="10"/>
     <w:rsid w:val="00A470D6"/>
     <w:rPr>
-      <w:rFonts w:asciiTheme="majorHAnsi" w:hAnsiTheme="majorHAnsi" w:eastAsiaTheme="majorEastAsia" w:cstheme="majorBidi"/>
+      <w:rFonts w:asciiTheme="majorHAnsi" w:eastAsiaTheme="majorEastAsia" w:hAnsiTheme="majorHAnsi" w:cstheme="majorBidi"/>
       <w:spacing w:val="-10"/>
       <w:kern w:val="28"/>
       <w:sz w:val="56"/>
@@ -1390,7 +1474,7 @@
       <w:szCs w:val="28"/>
     </w:rPr>
   </w:style>
-  <w:style w:type="character" w:styleId="SubtitleChar" w:customStyle="1">
+  <w:style w:type="character" w:customStyle="1" w:styleId="SubtitleChar">
     <w:name w:val="Subtitle Char"/>
     <w:basedOn w:val="DefaultParagraphFont"/>
     <w:link w:val="Subtitle"/>
@@ -1423,7 +1507,7 @@
       <w:color w:val="404040" w:themeColor="text1" w:themeTint="BF"/>
     </w:rPr>
   </w:style>
-  <w:style w:type="character" w:styleId="QuoteChar" w:customStyle="1">
+  <w:style w:type="character" w:customStyle="1" w:styleId="QuoteChar">
     <w:name w:val="Quote Char"/>
     <w:basedOn w:val="DefaultParagraphFont"/>
     <w:link w:val="Quote"/>
@@ -1469,8 +1553,8 @@
     <w:rsid w:val="00A470D6"/>
     <w:pPr>
       <w:pBdr>
-        <w:top w:val="single" w:color="2F5496" w:themeColor="accent1" w:themeShade="BF" w:sz="4" w:space="10"/>
-        <w:bottom w:val="single" w:color="2F5496" w:themeColor="accent1" w:themeShade="BF" w:sz="4" w:space="10"/>
+        <w:top w:val="single" w:sz="4" w:space="10" w:color="2F5496" w:themeColor="accent1" w:themeShade="BF"/>
+        <w:bottom w:val="single" w:sz="4" w:space="10" w:color="2F5496" w:themeColor="accent1" w:themeShade="BF"/>
       </w:pBdr>
       <w:spacing w:before="360" w:after="360"/>
       <w:ind w:left="864" w:right="864"/>
@@ -1482,7 +1566,7 @@
       <w:color w:val="2F5496" w:themeColor="accent1" w:themeShade="BF"/>
     </w:rPr>
   </w:style>
-  <w:style w:type="character" w:styleId="IntenseQuoteChar" w:customStyle="1">
+  <w:style w:type="character" w:customStyle="1" w:styleId="IntenseQuoteChar">
     <w:name w:val="Intense Quote Char"/>
     <w:basedOn w:val="DefaultParagraphFont"/>
     <w:link w:val="IntenseQuote"/>
@@ -1509,11 +1593,89 @@
       <w:spacing w:val="5"/>
     </w:rPr>
   </w:style>
+  <w:style w:type="paragraph" w:styleId="CommentText">
+    <w:name w:val="annotation text"/>
+    <w:basedOn w:val="Normal"/>
+    <w:link w:val="CommentTextChar"/>
+    <w:uiPriority w:val="99"/>
+    <w:unhideWhenUsed/>
+    <w:pPr>
+      <w:spacing w:line="240" w:lineRule="auto"/>
+    </w:pPr>
+    <w:rPr>
+      <w:sz w:val="20"/>
+      <w:szCs w:val="20"/>
+    </w:rPr>
+  </w:style>
+  <w:style w:type="character" w:customStyle="1" w:styleId="CommentTextChar">
+    <w:name w:val="Comment Text Char"/>
+    <w:basedOn w:val="DefaultParagraphFont"/>
+    <w:link w:val="CommentText"/>
+    <w:uiPriority w:val="99"/>
+    <w:rPr>
+      <w:sz w:val="20"/>
+      <w:szCs w:val="20"/>
+      <w:lang w:val="en-GB"/>
+    </w:rPr>
+  </w:style>
+  <w:style w:type="character" w:styleId="CommentReference">
+    <w:name w:val="annotation reference"/>
+    <w:basedOn w:val="DefaultParagraphFont"/>
+    <w:uiPriority w:val="99"/>
+    <w:semiHidden/>
+    <w:unhideWhenUsed/>
+    <w:rPr>
+      <w:sz w:val="16"/>
+      <w:szCs w:val="16"/>
+    </w:rPr>
+  </w:style>
+  <w:style w:type="paragraph" w:styleId="CommentSubject">
+    <w:name w:val="annotation subject"/>
+    <w:basedOn w:val="CommentText"/>
+    <w:next w:val="CommentText"/>
+    <w:link w:val="CommentSubjectChar"/>
+    <w:uiPriority w:val="99"/>
+    <w:semiHidden/>
+    <w:unhideWhenUsed/>
+    <w:rsid w:val="00633D05"/>
+    <w:rPr>
+      <w:b/>
+      <w:bCs/>
+    </w:rPr>
+  </w:style>
+  <w:style w:type="character" w:customStyle="1" w:styleId="CommentSubjectChar">
+    <w:name w:val="Comment Subject Char"/>
+    <w:basedOn w:val="CommentTextChar"/>
+    <w:link w:val="CommentSubject"/>
+    <w:uiPriority w:val="99"/>
+    <w:semiHidden/>
+    <w:rsid w:val="00633D05"/>
+    <w:rPr>
+      <w:b/>
+      <w:bCs/>
+      <w:sz w:val="20"/>
+      <w:szCs w:val="20"/>
+      <w:lang w:val="en-GB"/>
+    </w:rPr>
+  </w:style>
+  <w:style w:type="paragraph" w:styleId="Revision">
+    <w:name w:val="Revision"/>
+    <w:hidden/>
+    <w:uiPriority w:val="99"/>
+    <w:semiHidden/>
+    <w:rsid w:val="0037302C"/>
+    <w:pPr>
+      <w:spacing w:after="0" w:line="240" w:lineRule="auto"/>
+    </w:pPr>
+    <w:rPr>
+      <w:lang w:val="en-GB"/>
+    </w:rPr>
+  </w:style>
 </w:styles>
 </file>
 
 <file path=word/theme/theme1.xml><?xml version="1.0" encoding="utf-8"?>
-<a:theme xmlns:a="http://schemas.openxmlformats.org/drawingml/2006/main" xmlns:thm15="http://schemas.microsoft.com/office/thememl/2012/main" name="Office Theme">
+<a:theme xmlns:a="http://schemas.openxmlformats.org/drawingml/2006/main" name="Office Theme">
   <a:themeElements>
     <a:clrScheme name="Office">
       <a:dk1>

</xml_diff>

<commit_message>
update for final submision thesis
</commit_message>
<xml_diff>
--- a/manuscript/Cover Letter.docx
+++ b/manuscript/Cover Letter.docx
@@ -29,10 +29,22 @@
         <w:t>“</w:t>
       </w:r>
       <w:r>
-        <w:t>Stone pile refuges in an Aotearoa New Zealand lake: early benefits for a threatened crayfish but not its invasive predator”</w:t>
-      </w:r>
-      <w:r>
-        <w:t xml:space="preserve"> to the Journal of Applied Ecology.</w:t>
+        <w:t>Stone pile refuges in an Aotearoa New Zealand lake: early benefits for threatened crayfish but not its invasive predator”</w:t>
+      </w:r>
+      <w:r>
+        <w:t xml:space="preserve"> to </w:t>
+      </w:r>
+      <w:r>
+        <w:t>Restoration Ecology</w:t>
+      </w:r>
+      <w:r>
+        <w:t xml:space="preserve"> as a </w:t>
+      </w:r>
+      <w:r>
+        <w:t>research article</w:t>
+      </w:r>
+      <w:r>
+        <w:t>.</w:t>
       </w:r>
     </w:p>
     <w:p>
@@ -508,17 +520,24 @@
         <w:jc w:val="both"/>
       </w:pPr>
       <w:r>
-        <w:t xml:space="preserve">We believe this manuscript fits the aims and scope of the </w:t>
+        <w:t xml:space="preserve">We believe this manuscript fits the aims and scope of </w:t>
       </w:r>
       <w:r>
         <w:rPr>
           <w:i/>
           <w:iCs/>
         </w:rPr>
-        <w:t>Journal of Applied Ecology</w:t>
-      </w:r>
-      <w:r>
-        <w:t xml:space="preserve"> well</w:t>
+        <w:t>Restoration Ecology</w:t>
+      </w:r>
+      <w:r>
+        <w:rPr>
+          <w:i/>
+          <w:iCs/>
+        </w:rPr>
+        <w:t xml:space="preserve"> </w:t>
+      </w:r>
+      <w:r>
+        <w:t>well</w:t>
       </w:r>
       <w:r>
         <w:t>.</w:t>
@@ -1266,7 +1285,6 @@
   <w:style w:type="character" w:default="1" w:styleId="DefaultParagraphFont">
     <w:name w:val="Default Paragraph Font"/>
     <w:uiPriority w:val="1"/>
-    <w:semiHidden/>
     <w:unhideWhenUsed/>
   </w:style>
   <w:style w:type="table" w:default="1" w:styleId="TableNormal">

</xml_diff>